<commit_message>
revamp rowing experience section: showcase grit, resilience and growth mindset
</commit_message>
<xml_diff>
--- a/assets/Rowing_Resume_JoeWei_Filled.docx
+++ b/assets/Rowing_Resume_JoeWei_Filled.docx
@@ -569,7 +569,19 @@
           <w:rFonts w:ascii="Calibri" w:hAnsi="Calibri"/>
           <w:sz w:val="22"/>
         </w:rPr>
-        <w:t>1 year of formal rowing training (since early 2025), built on 4 years of stand-up paddleboarding foundation (2019–2022). I compete primarily in Double Sculls (2x) and have trained in Quad Sculls (4x) as well. I am comfortable rowing in both bow and stroke seats in a double. My strength is staying calm under pressure and executing race plans — as shown in my debut race (4th → 1st comeback). Currently completing a 25-day intensive training camp at Taizhou Water Sports Training Base (June 18 – July 12, 2026), followed by a US college training tour with Yale, Princeton, Dartmouth, and Penn rowing programs (July 18 – August 14, 2026).</w:t>
+        <w:t>I came to rowing late — I didn't touch an oar until early 2025. But I've never let a late start stop me. Four years of stand-up paddleboarding (2019–2022) gave me water feel and core balance; rowing gave me the discipline I didn't know I needed.</w:t>
+        <w:br/>
+        <w:br/>
+        <w:t>What sets me apart isn't my experience — it's how I respond when things get hard. In my very first race, the 2026 Pinghu Open 500m Mixed Double Sculls, we were seeded 4th out of 4. Halfway through I made a decision: I was not going to lose. I stayed calm, stuck to our race plan, and we charged from last to first — winning by 0.46 seconds. That comeback wasn't luck. It was grit.</w:t>
+        <w:br/>
+        <w:br/>
+        <w:t>I compete primarily in Double Sculls (2x) and have trained in Quad Sculls (4x). I am comfortable rowing both bow and stroke seats. In every practice I push to learn something new — adjusting technique, reading water, syncing with partners. I know I am still early in my rowing journey, and that is exactly why I work harder.</w:t>
+        <w:br/>
+        <w:br/>
+        <w:t>Right now I am living that commitment: 25-day intensive camp at Taizhou Water Sports Training Base (June 18 – July 12, 2026) — up at 6:40am, two sessions on the water daily, pushing my 2K erg from 7:41 toward 7:20. In July I will train with Yale, Princeton, Dartmouth, and Penn rowing programs (July 18 – August 14, 2026), learning from the best and proving that I belong.</w:t>
+        <w:br/>
+        <w:br/>
+        <w:t>I am not the most experienced rower in the boathouse. But I am the one who will outwork everyone.</w:t>
       </w:r>
     </w:p>
     <w:p>

</xml_diff>

<commit_message>
rewrite self-intro and rowing experience in Joe's authentic voice, remove AI-sounding language
</commit_message>
<xml_diff>
--- a/assets/Rowing_Resume_JoeWei_Filled.docx
+++ b/assets/Rowing_Resume_JoeWei_Filled.docx
@@ -170,7 +170,19 @@
           <w:rFonts w:ascii="Calibri" w:hAnsi="Calibri"/>
           <w:sz w:val="22"/>
         </w:rPr>
-        <w:t>I am a driven and versatile student-athlete who loves pushing limits — both in the classroom and on the water. I started paddleboarding at age 8 and spent four years building water confidence, balance, and core strength before transitioning to rowing. What I love most about rowing is the raw discipline it demands: every stroke is a choice to give more. My first race — the 2026 Pinghu Open 500m Mixed Double Sculls — taught me exactly that. Seeded 4th, my partner and I charged through the field and won by 0.46 seconds. That moment defined who I want to be as an athlete: someone who races smarter, harder, and never gives up. Beyond rowing, I thrive on intellectual challenges — I have won 38 awards in STEM competitions including international honors at WAICY (Global Silver), Pittsburgh Invention Convention (Global Silver + Best Creative), and iENA Nuremberg (1st Prize + Most Technological Value Award). I also co-founded OfferPath, a WeChat mini-program helping families navigate college admissions with data. I believe rowing is where my competitive spirit and my love for growth come together, and I am committed to earning a spot on a top NCAA Division 1 rowing program.</w:t>
+        <w:t>I wasn't born with a paddle in my hand. I started stand-up paddleboarding when I was 8 — just for fun, riding the waves near my grandparents' place. Four years on the water taught me balance and how to read currents, but I didn't really fall in love with rowing until early 2025, when I joined my school team.</w:t>
+        <w:br/>
+        <w:br/>
+        <w:t>Honestly? Rowing is hard. It hurts. But that's exactly why I love it. Every stroke asks you the same question: how much do you want this? And every time I answer.</w:t>
+        <w:br/>
+        <w:br/>
+        <w:t>My first race was the 2026 Pinghu Open 500m Mixed Double Sculls. We were seeded dead last — 4th out of 4. Everyone expected us to lose. Halfway through, I looked at my partner and we just decided: we are not coming in 4th. We caught the field, boat by boat, and won by 0.46 seconds. Crossing the finish line first, I knew — I don't just like rowing. I want to be great at it.</w:t>
+        <w:br/>
+        <w:br/>
+        <w:t>Outside the boat, I am the same kind of person — stubborn in a good way. I've won 38 awards in STEM competitions (WAICY Global Silver, iENA Nuremberg 1st Prize, Pittsburgh Invention Convention Global Silver + Best Creative). I co-founded OfferPath, a WeChat mini-program that helps families figure out college admissions with real data. I love building things, solving problems, and proving that I belong in rooms where people might not expect me.</w:t>
+        <w:br/>
+        <w:br/>
+        <w:t>I know I started rowing later than most college recruits. But I also know this: I have never backed down from a challenge, and I am not about to start now.</w:t>
       </w:r>
     </w:p>
     <w:p>

</xml_diff>

<commit_message>
replace self-intro with Joe's original version, keep rowing experience ending
</commit_message>
<xml_diff>
--- a/assets/Rowing_Resume_JoeWei_Filled.docx
+++ b/assets/Rowing_Resume_JoeWei_Filled.docx
@@ -170,19 +170,19 @@
           <w:rFonts w:ascii="Calibri" w:hAnsi="Calibri"/>
           <w:sz w:val="22"/>
         </w:rPr>
-        <w:t>I wasn't born with a paddle in my hand. I started stand-up paddleboarding when I was 8 — just for fun, riding the waves near my grandparents' place. Four years on the water taught me balance and how to read currents, but I didn't really fall in love with rowing until early 2025, when I joined my school team.</w:t>
+        <w:t>I didn't grow up with a paddle in my hands or anything. I started on a stand-up paddleboard when I was 8, just messing around on the water near my home, chasing waves for fun. Four years of that taught me how to stay balanced and read the water, but I didn't really get into rowing until early 2025, when I tried out for my school team.</w:t>
         <w:br/>
         <w:br/>
-        <w:t>Honestly? Rowing is hard. It hurts. But that's exactly why I love it. Every stroke asks you the same question: how much do you want this? And every time I answer.</w:t>
+        <w:t>Not gonna lie — rowing is brutal. Your lungs burn, your back aches, and your hands get shredded. But that's exactly what I love about it. Every single stroke forces you to ask yourself: how bad do you want it? And every time, I choose to pull harder.</w:t>
         <w:br/>
         <w:br/>
-        <w:t>My first race was the 2026 Pinghu Open 500m Mixed Double Sculls. We were seeded dead last — 4th out of 4. Everyone expected us to lose. Halfway through, I looked at my partner and we just decided: we are not coming in 4th. We caught the field, boat by boat, and won by 0.46 seconds. Crossing the finish line first, I knew — I don't just like rowing. I want to be great at it.</w:t>
+        <w:t>My first race was the 2026 Pinghu Open 500m Mixed Double Sculls. We started together with everyone else, but about 200 meters in, we were dead last. Not gonna lie, it stung. But instead of giving up, we just started chasing. Boat by boat, we clawed our way back — passed third, then second, and in the final sprint, we edged out the leader by 0.46 seconds at the line. Crossing that finish line first? That's when I realized I don't just like rowing. I want to be really, really good at it.</w:t>
         <w:br/>
         <w:br/>
-        <w:t>Outside the boat, I am the same kind of person — stubborn in a good way. I've won 38 awards in STEM competitions (WAICY Global Silver, iENA Nuremberg 1st Prize, Pittsburgh Invention Convention Global Silver + Best Creative). I co-founded OfferPath, a WeChat mini-program that helps families figure out college admissions with real data. I love building things, solving problems, and proving that I belong in rooms where people might not expect me.</w:t>
+        <w:t>Off the water, I'm pretty much the same person — stubborn, but in a good way. I've picked up 38 awards in STEM comps, like WAICY Global Silver, iENA Nuremberg 1st Prize, and Pittsburgh Invention Convention Global Silver + Best Creative. I also co-founded a WeChat mini-program called OfferPath that helps families navigate college admissions with actual data. I just love building stuff, cracking problems, and proving I can hang in places where people might not expect me to.</w:t>
         <w:br/>
         <w:br/>
-        <w:t>I know I started rowing later than most college recruits. But I also know this: I have never backed down from a challenge, and I am not about to start now.</w:t>
+        <w:t>I know I started rowing later than most college recruits. But here's the thing — I've never backed down from anything in my life, and I'm sure not about to start now.</w:t>
       </w:r>
     </w:p>
     <w:p>

</xml_diff>

<commit_message>
sync race description across self-intro & rowing experience; fill tournament highlights & upcoming events sections
</commit_message>
<xml_diff>
--- a/assets/Rowing_Resume_JoeWei_Filled.docx
+++ b/assets/Rowing_Resume_JoeWei_Filled.docx
@@ -584,7 +584,7 @@
         <w:t>I came to rowing late — I didn't touch an oar until early 2025. But I've never let a late start stop me. Four years of stand-up paddleboarding (2019–2022) gave me water feel and core balance; rowing gave me the discipline I didn't know I needed.</w:t>
         <w:br/>
         <w:br/>
-        <w:t>What sets me apart isn't my experience — it's how I respond when things get hard. In my very first race, the 2026 Pinghu Open 500m Mixed Double Sculls, we were seeded 4th out of 4. Halfway through I made a decision: I was not going to lose. I stayed calm, stuck to our race plan, and we charged from last to first — winning by 0.46 seconds. That comeback wasn't luck. It was grit.</w:t>
+        <w:t>What sets me apart isn't my experience — it's how I respond when things get hard. My first race was the 2026 Pinghu Open 500m Mixed Double Sculls. We started together, but about 200 meters in, we were dead last. It stung. But instead of giving up, we started chasing. Boat by boat we clawed our way back — passed third, then second, and in the final sprint we edged out the leader by 0.46 seconds. That comeback wasn't luck. It was grit.</w:t>
         <w:br/>
         <w:br/>
         <w:t>I compete primarily in Double Sculls (2x) and have trained in Quad Sculls (4x). I am comfortable rowing both bow and stroke seats. In every practice I push to learn something new — adjusting technique, reading water, syncing with partners. I know I am still early in my rowing journey, and that is exactly why I work harder.</w:t>
@@ -609,7 +609,9 @@
           <w:color w:val="1A5C8A"/>
           <w:sz w:val="26"/>
         </w:rPr>
-        <w:t>6. Rowing Tournament Highlights</w:t>
+        <w:t>🏆 Pinghu Open 500m Mixed Double Sculls — 1st Place (2026)</w:t>
+        <w:br/>
+        <w:t xml:space="preserve">   Started together, fell to last at 200m, clawed back to win by 0.46 seconds. Debut race comeback.</w:t>
       </w:r>
     </w:p>
     <w:tbl>
@@ -835,7 +837,11 @@
           <w:color w:val="1A5C8A"/>
           <w:sz w:val="26"/>
         </w:rPr>
-        <w:t>7. Upcoming Events</w:t>
+        <w:t>📅 June 18 – July 12, 2026 — Taizhou Water Sports Training Base (25-day intensive camp)</w:t>
+        <w:br/>
+        <w:t>📅 July 12, 2026 — 2K erg test (target: 7:20)</w:t>
+        <w:br/>
+        <w:t>📅 July 18 – August 14, 2026 — US college training tour: Yale · Princeton · Dartmouth · Penn</w:t>
       </w:r>
     </w:p>
     <w:tbl>

</xml_diff>